<commit_message>
Embed company seal in document templates
</commit_message>
<xml_diff>
--- a/resource/奇点电商平台产品服务合同模板.docx
+++ b/resource/奇点电商平台产品服务合同模板.docx
@@ -1513,7 +1513,7 @@
               <w:bottom w:val="nil"/>
               <w:right w:val="nil"/>
             </w:tcBorders>
-            <w:vAlign w:val="center"/>
+            <w:vAlign w:val="top"/>
           </w:tcPr>
           <w:p>
             <w:pPr>
@@ -1584,7 +1584,7 @@
               <w:bottom w:val="nil"/>
               <w:right w:val="nil"/>
             </w:tcBorders>
-            <w:vAlign w:val="center"/>
+            <w:vAlign w:val="top"/>
           </w:tcPr>
           <w:p>
             <w:pPr>
@@ -1652,6 +1652,46 @@
                 <w:lang w:eastAsia="zh-CN"/>
               </w:rPr>
               <w:t>：</w:t>
+            </w:r>
+          </w:p>
+          <w:p>
+            <w:pPr>
+              <w:spacing w:before="0" w:after="0"/>
+              <w:jc w:val="center"/>
+            </w:pPr>
+            <w:r>
+              <w:drawing>
+                <wp:inline xmlns:a="http://schemas.openxmlformats.org/drawingml/2006/main" xmlns:pic="http://schemas.openxmlformats.org/drawingml/2006/picture">
+                  <wp:extent cx="1152000" cy="1159200"/>
+                  <wp:docPr id="2" name="Picture 2"/>
+                  <wp:cNvGraphicFramePr>
+                    <a:graphicFrameLocks noChangeAspect="1"/>
+                  </wp:cNvGraphicFramePr>
+                  <a:graphic>
+                    <a:graphicData uri="http://schemas.openxmlformats.org/drawingml/2006/picture">
+                      <pic:pic>
+                        <pic:nvPicPr>
+                          <pic:cNvPr id="0" name="image.png"/>
+                          <pic:cNvPicPr/>
+                        </pic:nvPicPr>
+                        <pic:blipFill>
+                          <a:blip r:embed="rId13"/>
+                          <a:stretch>
+                            <a:fillRect/>
+                          </a:stretch>
+                        </pic:blipFill>
+                        <pic:spPr>
+                          <a:xfrm>
+                            <a:off x="0" y="0"/>
+                            <a:ext cx="1152000" cy="1159200"/>
+                          </a:xfrm>
+                          <a:prstGeom prst="rect"/>
+                        </pic:spPr>
+                      </pic:pic>
+                    </a:graphicData>
+                  </a:graphic>
+                </wp:inline>
+              </w:drawing>
             </w:r>
           </w:p>
         </w:tc>

</xml_diff>

<commit_message>
Update product contract template
</commit_message>
<xml_diff>
--- a/resource/奇点电商平台产品服务合同模板.docx
+++ b/resource/奇点电商平台产品服务合同模板.docx
@@ -13,7 +13,7 @@
           <w:noProof/>
         </w:rPr>
         <w:drawing>
-          <wp:inline distT="0" distB="0" distL="0" distR="0" wp14:anchorId="2C7E3892" wp14:editId="014CF5F6">
+          <wp:inline distT="0" distB="0" distL="0" distR="0" wp14:anchorId="20CE4B97" wp14:editId="2536A82A">
             <wp:extent cx="1440000" cy="1542857"/>
             <wp:effectExtent l="0" t="0" r="0" b="0"/>
             <wp:docPr id="1" name="Picture 1"/>
@@ -378,7 +378,25 @@
           <w:bCs/>
           <w:lang w:eastAsia="zh-CN"/>
         </w:rPr>
-        <w:t>4-1-1  甲方承诺该从事的行业，须符合国家法律法规，合作期间不得从事违法经营或提供给不法分子进行违法诈骗洗钱收款等服务，甲方不得以转让、出租、出借、抵押、质押、留置或以其他任何方式处分开通的系统产品等，不得自行或允许他人修改程序数据、破坏程序等软件。如有违反，由此造成的资金损失和风险责任由甲方承担，造成乙方损失的，甲方应予赔偿，如涉嫌违规异常被风控具体根据官方风险提示为准，使用过程中订单投诉未处理我司做出多次提醒未处理，如有违规以上条例，乙方有权终止与甲方的合作，甲方所交任何费用不予退还如有造成乙方的损失全部由甲方承担。</w:t>
+        <w:t>4-1-1  甲方承诺该从事的行业，须符合国家法律法规，合作期间不得从事违法经营或提供给不法分子进行违法诈骗洗钱收款等服务，甲方不得以转让、出租、出借、抵押、质押、留置或以其他任何方式处分开通的系统产品等，不得自行或允许他人修改程序数据、破坏程序等软件。如有违反，由此造成的资金损失和风险责任由甲方承担，造成乙方损失的，甲方应予赔偿，如涉嫌违规</w:t>
+      </w:r>
+      <w:proofErr w:type="gramStart"/>
+      <w:r>
+        <w:rPr>
+          <w:b/>
+          <w:bCs/>
+          <w:lang w:eastAsia="zh-CN"/>
+        </w:rPr>
+        <w:t>异常被风控具体</w:t>
+      </w:r>
+      <w:proofErr w:type="gramEnd"/>
+      <w:r>
+        <w:rPr>
+          <w:b/>
+          <w:bCs/>
+          <w:lang w:eastAsia="zh-CN"/>
+        </w:rPr>
+        <w:t>根据官方风险提示为准，使用过程中订单投诉未处理我司做出多次提醒未处理，如有违规以上条例，乙方有权终止与甲方的合作，甲方所交任何费用不予退还如有造成乙方的损失全部由甲方承担。</w:t>
       </w:r>
     </w:p>
     <w:p>
@@ -416,7 +434,25 @@
           <w:bCs/>
           <w:lang w:eastAsia="zh-CN"/>
         </w:rPr>
-        <w:t>4-1-3  本合同标的的使用应当符合国家法律规定和社会公共利益。</w:t>
+        <w:t>4-1-3  本合同标的</w:t>
+      </w:r>
+      <w:proofErr w:type="gramStart"/>
+      <w:r>
+        <w:rPr>
+          <w:b/>
+          <w:bCs/>
+          <w:lang w:eastAsia="zh-CN"/>
+        </w:rPr>
+        <w:t>的</w:t>
+      </w:r>
+      <w:proofErr w:type="gramEnd"/>
+      <w:r>
+        <w:rPr>
+          <w:b/>
+          <w:bCs/>
+          <w:lang w:eastAsia="zh-CN"/>
+        </w:rPr>
+        <w:t>使用应当符合国家法律规定和社会公共利益。</w:t>
       </w:r>
     </w:p>
     <w:p>
@@ -462,6 +498,7 @@
         <w:widowControl w:val="0"/>
         <w:jc w:val="both"/>
         <w:rPr>
+          <w:rFonts w:hint="eastAsia"/>
           <w:b/>
           <w:bCs/>
           <w:lang w:eastAsia="zh-CN"/>
@@ -473,12 +510,31 @@
           <w:bCs/>
           <w:lang w:eastAsia="zh-CN"/>
         </w:rPr>
-        <w:t>4-1-6  甲方给予乙方开发程序及对接微信支付宝等类型支付开通时，应如实登记甲方信息，提供资质证明材料（包括但不限于营业执照、法定代表人/负责人/经营者有效身份证件、手机号码、结算银行卡、办公场所照片或视频资料及其他相关证明文件，若甲方从事特定许可业务还应提供许可文件），并交由乙方留存资质证明材料复印件或影印件，甲方应保证所提供信息材料均真实、完整、合法、有效。若甲方资质证明材料存在有效期的，应在过期前向乙方提供续期证明或新的证明文件。</w:t>
+        <w:t>4-1-6  甲方给予乙方开发程序及对接</w:t>
+      </w:r>
+      <w:proofErr w:type="gramStart"/>
+      <w:r>
+        <w:rPr>
+          <w:b/>
+          <w:bCs/>
+          <w:lang w:eastAsia="zh-CN"/>
+        </w:rPr>
+        <w:t>微信支付宝</w:t>
+      </w:r>
+      <w:proofErr w:type="gramEnd"/>
+      <w:r>
+        <w:rPr>
+          <w:b/>
+          <w:bCs/>
+          <w:lang w:eastAsia="zh-CN"/>
+        </w:rPr>
+        <w:t>等类型支付开通时，应如实登记甲方信息，提供资质证明材料（包括但不限于营业执照、法定代表人/负责人/经营者有效身份证件、手机号码、结算银行卡、办公场所照片或视频资料及其他相关证明文件，若甲方从事特定许可业务还应提供许可文件），并交由乙方留存资质证明材料复印件或影印件，甲方应保证所提供信息材料均真实、完整、合法、有效。若甲方资质证明材料存在有效期的，应在过期前向乙方提供续期证明或新的证明文件。</w:t>
       </w:r>
     </w:p>
     <w:p>
       <w:pPr>
         <w:widowControl w:val="0"/>
+        <w:jc w:val="both"/>
         <w:rPr>
           <w:b/>
           <w:bCs/>
@@ -491,27 +547,43 @@
           <w:bCs/>
           <w:lang w:eastAsia="zh-CN"/>
         </w:rPr>
-        <w:br w:type="page"/>
+        <w:t>4-1-7  乙方所开发的程序承诺甲方客户付款的所有资金不经过乙方公司，甲方客户在乙方的程序支付后资金直接秒入甲方所对接官方的接口，资金直</w:t>
       </w:r>
-    </w:p>
-    <w:p>
-      <w:pPr>
-        <w:widowControl w:val="0"/>
-        <w:jc w:val="both"/>
-        <w:rPr>
-          <w:b/>
-          <w:bCs/>
-          <w:lang w:eastAsia="zh-CN"/>
-        </w:rPr>
-      </w:pPr>
+      <w:proofErr w:type="gramStart"/>
       <w:r>
         <w:rPr>
           <w:b/>
           <w:bCs/>
           <w:lang w:eastAsia="zh-CN"/>
         </w:rPr>
-        <w:lastRenderedPageBreak/>
-        <w:t>4-1-7  乙方所开发的程序承诺甲方客户付款的所有资金不经过乙方公司，甲方客户在乙方的程序支付后资金直接秒入甲方所对接官方的接口，资金直连微信官方及支付宝官方，所有资金结算于甲方对接于微信及支付宝当中，与乙方不牵扯任何关系。</w:t>
+        <w:t>连微信官方</w:t>
+      </w:r>
+      <w:proofErr w:type="gramEnd"/>
+      <w:r>
+        <w:rPr>
+          <w:b/>
+          <w:bCs/>
+          <w:lang w:eastAsia="zh-CN"/>
+        </w:rPr>
+        <w:t>及支付宝官方，所有资金结算于甲方对接</w:t>
+      </w:r>
+      <w:proofErr w:type="gramStart"/>
+      <w:r>
+        <w:rPr>
+          <w:b/>
+          <w:bCs/>
+          <w:lang w:eastAsia="zh-CN"/>
+        </w:rPr>
+        <w:t>于微信及</w:t>
+      </w:r>
+      <w:proofErr w:type="gramEnd"/>
+      <w:r>
+        <w:rPr>
+          <w:b/>
+          <w:bCs/>
+          <w:lang w:eastAsia="zh-CN"/>
+        </w:rPr>
+        <w:t>支付宝当中，与乙方不牵扯任何关系。</w:t>
       </w:r>
     </w:p>
     <w:p>
@@ -567,7 +639,25 @@
           <w:bCs/>
           <w:lang w:eastAsia="zh-CN"/>
         </w:rPr>
-        <w:t>4-2-1  按照甲方提供的资料信息给甲方定制收银平台系统方案。乙方只负责定制收款平台或程序的开发方案，但由于甲方第三方账户等问题存在不确定性事件（账户账号冻结，账户违规等），所造成的后果，乙方概不负责。</w:t>
+        <w:t>4-2-1  按照甲方提供的资料信息给甲方定制收银平台系统方案。</w:t>
+      </w:r>
+      <w:proofErr w:type="gramStart"/>
+      <w:r>
+        <w:rPr>
+          <w:b/>
+          <w:bCs/>
+          <w:lang w:eastAsia="zh-CN"/>
+        </w:rPr>
+        <w:t>乙方只</w:t>
+      </w:r>
+      <w:proofErr w:type="gramEnd"/>
+      <w:r>
+        <w:rPr>
+          <w:b/>
+          <w:bCs/>
+          <w:lang w:eastAsia="zh-CN"/>
+        </w:rPr>
+        <w:t>负责定制收款平台或程序的开发方案，但由于甲方第三方账户等问题存在不确定性事件（账户账号冻结，账户违规等），所造成的后果，乙方概不负责。</w:t>
       </w:r>
     </w:p>
     <w:p>
@@ -624,6 +714,7 @@
           <w:bCs/>
           <w:lang w:eastAsia="zh-CN"/>
         </w:rPr>
+        <w:lastRenderedPageBreak/>
         <w:t>5-1  合同金额：定制方案总费用</w:t>
       </w:r>
       <w:r>
@@ -758,7 +849,25 @@
           <w:bCs/>
           <w:lang w:eastAsia="zh-CN"/>
         </w:rPr>
-        <w:t>5-3  包含本附件中双方所确认的功能，乙方只负责甲方的程序对接工作，如甲方原因造成的平台无法使用或不能够正常运行情况下，乙方可收取甲方相关维护费用。</w:t>
+        <w:t>5-3  包含本附件中双方所确认的功能，</w:t>
+      </w:r>
+      <w:proofErr w:type="gramStart"/>
+      <w:r>
+        <w:rPr>
+          <w:b/>
+          <w:bCs/>
+          <w:lang w:eastAsia="zh-CN"/>
+        </w:rPr>
+        <w:t>乙方只</w:t>
+      </w:r>
+      <w:proofErr w:type="gramEnd"/>
+      <w:r>
+        <w:rPr>
+          <w:b/>
+          <w:bCs/>
+          <w:lang w:eastAsia="zh-CN"/>
+        </w:rPr>
+        <w:t>负责甲方的程序对接工作，如甲方原因造成的平台无法使用或不能够正常运行情况下，乙方可收取甲方相关维护费用。</w:t>
       </w:r>
     </w:p>
     <w:p>
@@ -922,7 +1031,25 @@
           <w:bCs/>
           <w:lang w:eastAsia="zh-CN"/>
         </w:rPr>
-        <w:t>（非法人入账如有黑款我司将报警处理）</w:t>
+        <w:t>（非法人入账如</w:t>
+      </w:r>
+      <w:proofErr w:type="gramStart"/>
+      <w:r>
+        <w:rPr>
+          <w:b/>
+          <w:bCs/>
+          <w:lang w:eastAsia="zh-CN"/>
+        </w:rPr>
+        <w:t>有黑款我司</w:t>
+      </w:r>
+      <w:proofErr w:type="gramEnd"/>
+      <w:r>
+        <w:rPr>
+          <w:b/>
+          <w:bCs/>
+          <w:lang w:eastAsia="zh-CN"/>
+        </w:rPr>
+        <w:t>将报警处理）</w:t>
       </w:r>
     </w:p>
     <w:p>
@@ -949,6 +1076,7 @@
         <w:widowControl w:val="0"/>
         <w:spacing w:before="40" w:line="300" w:lineRule="auto"/>
         <w:rPr>
+          <w:rFonts w:hint="eastAsia"/>
           <w:b/>
           <w:bCs/>
           <w:lang w:eastAsia="zh-CN"/>
@@ -960,12 +1088,49 @@
           <w:bCs/>
           <w:lang w:eastAsia="zh-CN"/>
         </w:rPr>
-        <w:t>第六条  甲方承诺，向乙方提供的内容、资料等不会侵犯任何第三方的权利，若发生侵犯第三方的权利的情形，由甲方承担全部责任，甲方不得将账号转让给他人使用，甲方承诺我已认真阅读本协议合约会遵守相关协议内容，也明确知晓（中华人民共和国反洗钱法）等相关法律法规规定，承诺严格遵守相关法律法规合规经营，甲方不会直接或变相的从事互联网赌博、色情、互联网销售彩票、非法外汇、贵金属投资交易、刷单诈骗、非法证券交易类、代币发行融资、及虚拟货币交易等违法违规平台，也不得未经监管批准的互联网开展资产管理和未取得省级政府批文开展大宗商品交易等违法违规及乙方禁止接入的业务否则乙方有权关停商户等使用权限且不予退还任何服务费等款项，如甲方违约造成对乙方的损失全部由甲方承担。</w:t>
+        <w:t>第六条  甲方承诺，向乙方提供的内容、资料等不会侵犯任何第三方的权利，若发生侵犯第三方的权利的情形，由甲方承担全部责任，甲方不得将账号转让给他人使用，甲方承诺我已认真阅读本协议合约会遵守相关协议内容，也明确知晓（中华人民共和国反洗钱法）等相关法律法规规定，承诺严格遵守相关法律法规合</w:t>
+      </w:r>
+      <w:proofErr w:type="gramStart"/>
+      <w:r>
+        <w:rPr>
+          <w:b/>
+          <w:bCs/>
+          <w:lang w:eastAsia="zh-CN"/>
+        </w:rPr>
+        <w:t>规</w:t>
+      </w:r>
+      <w:proofErr w:type="gramEnd"/>
+      <w:r>
+        <w:rPr>
+          <w:b/>
+          <w:bCs/>
+          <w:lang w:eastAsia="zh-CN"/>
+        </w:rPr>
+        <w:t>经营，甲方不会直接或变相的从事互联网赌博、色情、互联网销售彩票、非法外汇、贵金属投资交易、</w:t>
+      </w:r>
+      <w:proofErr w:type="gramStart"/>
+      <w:r>
+        <w:rPr>
+          <w:b/>
+          <w:bCs/>
+          <w:lang w:eastAsia="zh-CN"/>
+        </w:rPr>
+        <w:t>刷单诈骗</w:t>
+      </w:r>
+      <w:proofErr w:type="gramEnd"/>
+      <w:r>
+        <w:rPr>
+          <w:b/>
+          <w:bCs/>
+          <w:lang w:eastAsia="zh-CN"/>
+        </w:rPr>
+        <w:t>、非法证券交易类、代币发行融资、及虚拟货币交易等违法违规平台，也不得未经监管批准的互联网开展资产管理和未取得省级政府批文开展大宗商品交易等违法违规及乙方禁止接入的业务否则乙方有权关停商户等使用权限且不予退还任何服务费等款项，如甲方违约造成对乙方的损失全部由甲方承担。</w:t>
       </w:r>
     </w:p>
     <w:p>
       <w:pPr>
         <w:widowControl w:val="0"/>
+        <w:spacing w:before="40" w:line="300" w:lineRule="auto"/>
         <w:rPr>
           <w:b/>
           <w:bCs/>
@@ -978,27 +1143,25 @@
           <w:bCs/>
           <w:lang w:eastAsia="zh-CN"/>
         </w:rPr>
-        <w:br w:type="page"/>
+        <w:t>第七条  甲方不能按时支付合同费用，导致的工期延误，其责任由甲方承担，其签订合同后在3天内</w:t>
       </w:r>
-    </w:p>
-    <w:p>
-      <w:pPr>
-        <w:widowControl w:val="0"/>
-        <w:spacing w:before="40" w:line="300" w:lineRule="auto"/>
-        <w:rPr>
-          <w:b/>
-          <w:bCs/>
-          <w:lang w:eastAsia="zh-CN"/>
-        </w:rPr>
-      </w:pPr>
+      <w:proofErr w:type="gramStart"/>
       <w:r>
         <w:rPr>
           <w:b/>
           <w:bCs/>
           <w:lang w:eastAsia="zh-CN"/>
         </w:rPr>
-        <w:lastRenderedPageBreak/>
-        <w:t>第七条  甲方不能按时支付合同费用，导致的工期延误，其责任由甲方承担，其签订合同后在3天内请支付首款定金或全款支付。</w:t>
+        <w:t>请支付</w:t>
+      </w:r>
+      <w:proofErr w:type="gramEnd"/>
+      <w:r>
+        <w:rPr>
+          <w:b/>
+          <w:bCs/>
+          <w:lang w:eastAsia="zh-CN"/>
+        </w:rPr>
+        <w:t>首款定金或全款支付。</w:t>
       </w:r>
     </w:p>
     <w:p>
@@ -1131,6 +1294,7 @@
           <w:bCs/>
           <w:lang w:eastAsia="zh-CN"/>
         </w:rPr>
+        <w:lastRenderedPageBreak/>
         <w:t>第十四条  任何一方违反本合同，给对方造成损失的，还应赔偿损失。在本合同其他条款对违约有具体约定时，从其约定。</w:t>
       </w:r>
     </w:p>
@@ -1375,7 +1539,6 @@
           <w:bCs/>
           <w:lang w:eastAsia="zh-CN"/>
         </w:rPr>
-        <w:lastRenderedPageBreak/>
         <w:t>第二十一条  本合同经双方授权代表签字并盖章，自签订日起生效。</w:t>
       </w:r>
     </w:p>
@@ -1513,7 +1676,6 @@
               <w:bottom w:val="nil"/>
               <w:right w:val="nil"/>
             </w:tcBorders>
-            <w:vAlign w:val="top"/>
           </w:tcPr>
           <w:p>
             <w:pPr>
@@ -1584,7 +1746,6 @@
               <w:bottom w:val="nil"/>
               <w:right w:val="nil"/>
             </w:tcBorders>
-            <w:vAlign w:val="top"/>
           </w:tcPr>
           <w:p>
             <w:pPr>
@@ -1656,26 +1817,29 @@
           </w:p>
           <w:p>
             <w:pPr>
-              <w:spacing w:before="0" w:after="0"/>
               <w:jc w:val="center"/>
             </w:pPr>
             <w:r>
+              <w:rPr>
+                <w:noProof/>
+              </w:rPr>
               <w:drawing>
-                <wp:inline xmlns:a="http://schemas.openxmlformats.org/drawingml/2006/main" xmlns:pic="http://schemas.openxmlformats.org/drawingml/2006/picture">
+                <wp:inline distT="0" distB="0" distL="0" distR="0" wp14:anchorId="3CDE1199" wp14:editId="2E55F938">
                   <wp:extent cx="1152000" cy="1159200"/>
+                  <wp:effectExtent l="0" t="0" r="0" b="0"/>
                   <wp:docPr id="2" name="Picture 2"/>
                   <wp:cNvGraphicFramePr>
-                    <a:graphicFrameLocks noChangeAspect="1"/>
+                    <a:graphicFrameLocks xmlns:a="http://schemas.openxmlformats.org/drawingml/2006/main" noChangeAspect="1"/>
                   </wp:cNvGraphicFramePr>
-                  <a:graphic>
+                  <a:graphic xmlns:a="http://schemas.openxmlformats.org/drawingml/2006/main">
                     <a:graphicData uri="http://schemas.openxmlformats.org/drawingml/2006/picture">
-                      <pic:pic>
+                      <pic:pic xmlns:pic="http://schemas.openxmlformats.org/drawingml/2006/picture">
                         <pic:nvPicPr>
                           <pic:cNvPr id="0" name="image.png"/>
                           <pic:cNvPicPr/>
                         </pic:nvPicPr>
                         <pic:blipFill>
-                          <a:blip r:embed="rId13"/>
+                          <a:blip r:embed="rId9"/>
                           <a:stretch>
                             <a:fillRect/>
                           </a:stretch>
@@ -1685,7 +1849,9 @@
                             <a:off x="0" y="0"/>
                             <a:ext cx="1152000" cy="1159200"/>
                           </a:xfrm>
-                          <a:prstGeom prst="rect"/>
+                          <a:prstGeom prst="rect">
+                            <a:avLst/>
+                          </a:prstGeom>
                         </pic:spPr>
                       </pic:pic>
                     </a:graphicData>
@@ -1851,7 +2017,25 @@
           <w:bCs/>
           <w:lang w:eastAsia="zh-CN"/>
         </w:rPr>
-        <w:t>6、如后续需要加户微信支付宝各收500元开发接口费用，延长质保期</w:t>
+        <w:t>6、如后续需要</w:t>
+      </w:r>
+      <w:proofErr w:type="gramStart"/>
+      <w:r>
+        <w:rPr>
+          <w:b/>
+          <w:bCs/>
+          <w:lang w:eastAsia="zh-CN"/>
+        </w:rPr>
+        <w:t>加户微信支付宝各</w:t>
+      </w:r>
+      <w:proofErr w:type="gramEnd"/>
+      <w:r>
+        <w:rPr>
+          <w:b/>
+          <w:bCs/>
+          <w:lang w:eastAsia="zh-CN"/>
+        </w:rPr>
+        <w:t>收500元开发接口费用，延长质保期</w:t>
       </w:r>
       <w:r>
         <w:rPr>
@@ -1960,8 +2144,8 @@
       </w:r>
     </w:p>
     <w:sectPr>
-      <w:headerReference w:type="default" r:id="rId9"/>
-      <w:footerReference w:type="default" r:id="rId10"/>
+      <w:headerReference w:type="default" r:id="rId10"/>
+      <w:footerReference w:type="default" r:id="rId11"/>
       <w:pgSz w:w="11906" w:h="16838"/>
       <w:pgMar w:top="907" w:right="1191" w:bottom="850" w:left="1191" w:header="720" w:footer="720" w:gutter="0"/>
       <w:cols w:space="720"/>
@@ -2008,10 +2192,10 @@
         <w:noProof/>
       </w:rPr>
       <w:drawing>
-        <wp:inline distT="0" distB="0" distL="0" distR="0" wp14:anchorId="646609C0" wp14:editId="399104A9">
+        <wp:inline distT="0" distB="0" distL="0" distR="0" wp14:anchorId="1CE057A8" wp14:editId="658F9521">
           <wp:extent cx="270000" cy="289286"/>
           <wp:effectExtent l="0" t="0" r="0" b="0"/>
-          <wp:docPr id="3" name="Picture 1"/>
+          <wp:docPr id="4" name="Picture 1"/>
           <wp:cNvGraphicFramePr>
             <a:graphicFrameLocks xmlns:a="http://schemas.openxmlformats.org/drawingml/2006/main" noChangeAspect="1"/>
           </wp:cNvGraphicFramePr>
@@ -2083,10 +2267,10 @@
         <w:noProof/>
       </w:rPr>
       <w:drawing>
-        <wp:inline distT="0" distB="0" distL="0" distR="0" wp14:anchorId="5B59AE23" wp14:editId="1A7A6449">
+        <wp:inline distT="0" distB="0" distL="0" distR="0" wp14:anchorId="15FDEE9B" wp14:editId="49B76D13">
           <wp:extent cx="270000" cy="289286"/>
           <wp:effectExtent l="0" t="0" r="0" b="0"/>
-          <wp:docPr id="2" name="Picture 1"/>
+          <wp:docPr id="3" name="Picture 1"/>
           <wp:cNvGraphicFramePr>
             <a:graphicFrameLocks xmlns:a="http://schemas.openxmlformats.org/drawingml/2006/main" noChangeAspect="1"/>
           </wp:cNvGraphicFramePr>

</xml_diff>